<commit_message>
Refine supplemental responses and add result figures
</commit_message>
<xml_diff>
--- a/Progress Report - Supplemented Responses.docx
+++ b/Progress Report - Supplemented Responses.docx
@@ -9562,6 +9562,58 @@
       </w:r>
     </w:p>
     <w:p>
+      <w:pPr>
+        <w:jc w:val="center"/>
+      </w:pPr>
+      <w:r>
+        <w:drawing>
+          <wp:inline xmlns:a="http://schemas.openxmlformats.org/drawingml/2006/main" xmlns:pic="http://schemas.openxmlformats.org/drawingml/2006/picture">
+            <wp:extent cx="5577840" cy="3094475"/>
+            <wp:docPr id="2048837425" name="Picture 2048837425"/>
+            <wp:cNvGraphicFramePr>
+              <a:graphicFrameLocks noChangeAspect="1"/>
+            </wp:cNvGraphicFramePr>
+            <a:graphic>
+              <a:graphicData uri="http://schemas.openxmlformats.org/drawingml/2006/picture">
+                <pic:pic>
+                  <pic:nvPicPr>
+                    <pic:cNvPr id="0" name="a40_scaling.png"/>
+                    <pic:cNvPicPr/>
+                  </pic:nvPicPr>
+                  <pic:blipFill>
+                    <a:blip r:embed="rId28"/>
+                    <a:stretch>
+                      <a:fillRect/>
+                    </a:stretch>
+                  </pic:blipFill>
+                  <pic:spPr>
+                    <a:xfrm>
+                      <a:off x="0" y="0"/>
+                      <a:ext cx="5577840" cy="3094475"/>
+                    </a:xfrm>
+                    <a:prstGeom prst="rect"/>
+                  </pic:spPr>
+                </pic:pic>
+              </a:graphicData>
+            </a:graphic>
+          </wp:inline>
+        </w:drawing>
+      </w:r>
+    </w:p>
+    <w:p>
+      <w:pPr>
+        <w:jc w:val="center"/>
+      </w:pPr>
+      <w:r>
+        <w:rPr>
+          <w:rFonts w:ascii="Times New Roman" w:hAnsi="Times New Roman"/>
+          <w:color w:val="8B4513"/>
+          <w:sz w:val="18"/>
+        </w:rPr>
+        <w:t>Figure 7. Median runtime on one and two Vanda A40 GPUs for the paired strong-scaling sweep. The gap widens with sequence length; the small N=1024 case is dominated by distributed-run overhead.</w:t>
+      </w:r>
+    </w:p>
+    <w:p>
       <w:pPr/>
       <w:commentRangeStart w:id="6"/>
       <w:r>
@@ -10228,6 +10280,58 @@
           <w:rStyle w:val="CommentReference"/>
         </w:rPr>
         <w:commentReference w:id="7"/>
+      </w:r>
+    </w:p>
+    <w:p>
+      <w:pPr>
+        <w:jc w:val="center"/>
+      </w:pPr>
+      <w:r>
+        <w:drawing>
+          <wp:inline xmlns:a="http://schemas.openxmlformats.org/drawingml/2006/main" xmlns:pic="http://schemas.openxmlformats.org/drawingml/2006/picture">
+            <wp:extent cx="5577840" cy="2598240"/>
+            <wp:docPr id="2048837426" name="Picture 2048837426"/>
+            <wp:cNvGraphicFramePr>
+              <a:graphicFrameLocks noChangeAspect="1"/>
+            </wp:cNvGraphicFramePr>
+            <a:graphic>
+              <a:graphicData uri="http://schemas.openxmlformats.org/drawingml/2006/picture">
+                <pic:pic>
+                  <pic:nvPicPr>
+                    <pic:cNvPr id="0" name="openmp_scaling.png"/>
+                    <pic:cNvPicPr/>
+                  </pic:nvPicPr>
+                  <pic:blipFill>
+                    <a:blip r:embed="rId29"/>
+                    <a:stretch>
+                      <a:fillRect/>
+                    </a:stretch>
+                  </pic:blipFill>
+                  <pic:spPr>
+                    <a:xfrm>
+                      <a:off x="0" y="0"/>
+                      <a:ext cx="5577840" cy="2598240"/>
+                    </a:xfrm>
+                    <a:prstGeom prst="rect"/>
+                  </pic:spPr>
+                </pic:pic>
+              </a:graphicData>
+            </a:graphic>
+          </wp:inline>
+        </w:drawing>
+      </w:r>
+    </w:p>
+    <w:p>
+      <w:pPr>
+        <w:jc w:val="center"/>
+      </w:pPr>
+      <w:r>
+        <w:rPr>
+          <w:rFonts w:ascii="Times New Roman" w:hAnsi="Times New Roman"/>
+          <w:color w:val="8B4513"/>
+          <w:sz w:val="18"/>
+        </w:rPr>
+        <w:t>Figure 8. OpenMP speedup and parallel efficiency at N=4096 on Vanda. Speedup is calculated relative to the one-thread median in Table 11, and efficiency is speedup divided by thread count.</w:t>
       </w:r>
     </w:p>
     <w:p>
@@ -40184,7 +40288,7 @@
         <w:ind w:firstLineChars="0" w:firstLine="0"/>
       </w:pPr>
       <w:r>
-        <w:t>We apologize that the feature dimensions were not stated clearly enough.</w:t>
+        <w:t>You're right; the notation needed a clearer definition.</w:t>
       </w:r>
     </w:p>
     <w:p>
@@ -40193,7 +40297,7 @@
         <w:ind w:firstLineChars="0" w:firstLine="0"/>
       </w:pPr>
       <w:r>
-        <w:t>Response: Section 2.1 now defines d as the query/key feature dimension and d_v as the value feature dimension, and gives the shapes of Q, K, V, and the output.</w:t>
+        <w:t>Section 2.1 now defines d as the query/key feature dimension and d_v as the value feature dimension, and gives the shapes of Q, K, V, and the output.</w:t>
       </w:r>
     </w:p>
   </w:comment>
@@ -40223,7 +40327,7 @@
         <w:ind w:firstLineChars="0" w:firstLine="0"/>
       </w:pPr>
       <w:r>
-        <w:t>We apologize that the earlier version did not number all tables clearly.</w:t>
+        <w:t>We had left the table numbering incomplete in the earlier report.</w:t>
       </w:r>
     </w:p>
     <w:p>
@@ -40232,7 +40336,7 @@
         <w:ind w:firstLineChars="0" w:firstLine="0"/>
       </w:pPr>
       <w:r>
-        <w:t>Response: Tables 1–9 are retained, and the supplementary tables are numbered consecutively as Tables 10–13, each with a descriptive caption.</w:t>
+        <w:t>The existing tables keep their numbers, and the added tables continue the sequence as Tables 10–13 with captions.</w:t>
       </w:r>
     </w:p>
   </w:comment>
@@ -40262,7 +40366,7 @@
         <w:ind w:firstLineChars="0" w:firstLine="0"/>
       </w:pPr>
       <w:r>
-        <w:t>We apologize for omitting these precision combinations from the original comparison.</w:t>
+        <w:t>That comparison was missing from our first set of measurements.</w:t>
       </w:r>
     </w:p>
     <w:p>
@@ -40271,7 +40375,7 @@
         <w:ind w:firstLineChars="0" w:firstLine="0"/>
       </w:pPr>
       <w:r>
-        <w:t>Response: Table 6 now includes Vanda serial CPU FP32 and A40 CUDA FP64 measurements at matched N. For example, at N=4096 the medians are 678.629 ms and 28.348 ms. The report notes that cross-device timing differences are not attributable to precision alone.</w:t>
+        <w:t>Table 6 now includes Vanda serial CPU FP32 and A40 CUDA FP64 at matched N. At N=4096, their medians are 678.629 ms and 28.348 ms; the report also cautions that hardware and precision both differ across devices.</w:t>
       </w:r>
     </w:p>
   </w:comment>
@@ -40301,7 +40405,7 @@
         <w:ind w:firstLineChars="0" w:firstLine="0"/>
       </w:pPr>
       <w:r>
-        <w:t>We apologize that the earlier discussion did not explain the expected scaling clearly.</w:t>
+        <w:t>The original discussion should have made the expected growth more explicit.</w:t>
       </w:r>
     </w:p>
     <w:p>
@@ -40310,7 +40414,7 @@
         <w:ind w:firstLineChars="0" w:firstLine="0"/>
       </w:pPr>
       <w:r>
-        <w:t>Response: The report now states the O(N²) expectation for fixed feature dimensions and gives measured doubling ratios. Vanda A40 FP32 ratios are approximately 3.73×–4.11× over the tested larger N; CPU FP32 shows a 6.30× deviation from N=16384 to 32768, which is reported without claiming an unmeasured cause.</w:t>
+        <w:t>The report now gives the fixed-dimension O(N²) expectation and measured doubling ratios. The larger Vanda A40 FP32 sweep is about 3.73×–4.11× per doubling; the CPU FP32 result from N=16384 to 32768 is 6.30×, and is reported as measured without assigning an unverified cause.</w:t>
       </w:r>
     </w:p>
   </w:comment>
@@ -40340,7 +40444,7 @@
         <w:ind w:firstLineChars="0" w:firstLine="0"/>
       </w:pPr>
       <w:r>
-        <w:t>We apologize that the earlier report stopped at relatively small sequence lengths.</w:t>
+        <w:t>The earlier sequence-length range was too limited to show how the implementation behaves at larger sizes.</w:t>
       </w:r>
     </w:p>
     <w:p>
@@ -40349,7 +40453,7 @@
         <w:ind w:firstLineChars="0" w:firstLine="0"/>
       </w:pPr>
       <w:r>
-        <w:t>Response: Vanda A40 performance tests now extend through N=65536, and local RTX 4090 performance tests extend through N=1048576. Independent FP64-reference comparisons are reported through N=131072 for full and causal attention.</w:t>
+        <w:t>The Vanda A40 performance sweep now reaches N=65536, and the local RTX 4090 sweep reaches N=1048576. FP64-reference correctness comparisons are reported through N=131072 for full and causal attention.</w:t>
       </w:r>
     </w:p>
   </w:comment>
@@ -40379,7 +40483,7 @@
         <w:ind w:firstLineChars="0" w:firstLine="0"/>
       </w:pPr>
       <w:r>
-        <w:t>We apologize for not reporting host/device transfer time in the earlier version.</w:t>
+        <w:t>We had not separated transfer time from the other GPU timings.</w:t>
       </w:r>
     </w:p>
     <w:p>
@@ -40388,7 +40492,7 @@
         <w:ind w:firstLineChars="0" w:firstLine="0"/>
       </w:pPr>
       <w:r>
-        <w:t>Response: Table 12 reports Vanda A40 H2D, compute, timed-total, and separately measured D2H medians at N=4096, 8192, and 16384. The text states which phases are included in the timed total.</w:t>
+        <w:t>Table 12 gives H2D, compute, timed-total, and separately measured D2H medians for the Vanda A40 at N=4096, 8192, and 16384. The note below the table specifies which phases the timed total includes.</w:t>
       </w:r>
     </w:p>
   </w:comment>
@@ -40418,7 +40522,7 @@
         <w:ind w:firstLineChars="0" w:firstLine="0"/>
       </w:pPr>
       <w:r>
-        <w:t>We apologize for stopping the original OpenMP table at 8 threads.</w:t>
+        <w:t>The first OpenMP table stopped at eight threads, so it did not answer this point.</w:t>
       </w:r>
     </w:p>
     <w:p>
@@ -40427,7 +40531,7 @@
         <w:ind w:firstLineChars="0" w:firstLine="0"/>
       </w:pPr>
       <w:r>
-        <w:t>Response: Table 11 adds the Vanda 1/2/4/8/16/32/48/64/72-thread sweep at N=4096. The 72-thread median is 17.353 ms.</w:t>
+        <w:t>Table 11 now includes measurements at 1, 2, 4, 8, 16, 32, 48, 64, and 72 threads on Vanda. The 72-thread median at N=4096 is 17.353 ms.</w:t>
       </w:r>
     </w:p>
   </w:comment>
@@ -40457,7 +40561,7 @@
         <w:ind w:firstLineChars="0" w:firstLine="0"/>
       </w:pPr>
       <w:r>
-        <w:t>We apologize for omitting speedup and efficiency from the original tables.</w:t>
+        <w:t>We should have included these derived scaling measures alongside the runtimes.</w:t>
       </w:r>
     </w:p>
     <w:p>
@@ -40466,7 +40570,7 @@
         <w:ind w:firstLineChars="0" w:firstLine="0"/>
       </w:pPr>
       <w:r>
-        <w:t>Response: The new OpenMP and A40 strong-scaling tables report S_p=T_1/T_p and E_p=S_p/p. At N=4096, 72-thread OpenMP reaches 45.751× speedup and 63.54% efficiency; at N=65536, two A40 GPUs reach 1.991× and 99.54%.</w:t>
+        <w:t>Tables 10 and 11 now report speedup S_p=T_1/T_p and efficiency E_p=S_p/p. At N=65536, two A40 GPUs reach 1.991× speedup and 99.54% efficiency; at 72 OpenMP threads, the measured speedup is 45.751× with 63.54% efficiency.</w:t>
       </w:r>
     </w:p>
   </w:comment>
@@ -40496,7 +40600,7 @@
         <w:ind w:firstLineChars="0" w:firstLine="0"/>
       </w:pPr>
       <w:r>
-        <w:t>We apologize for not identifying the blocked loops explicitly.</w:t>
+        <w:t>The algorithm description did not say clearly which loops were blocked.</w:t>
       </w:r>
     </w:p>
     <w:p>
@@ -40505,7 +40609,7 @@
         <w:ind w:firstLineChars="0" w:firstLine="0"/>
       </w:pPr>
       <w:r>
-        <w:t>Response: Section 2.2 now states that the query-row loop is blocked by b_q and the circulating key/value loop by b_k, with the online softmax state updated for each arriving key/value tile.</w:t>
+        <w:t>Section 2.2 now identifies the query-row loop as b_q blocking and the circulating key/value loop as b_k blocking, and explains that the online softmax state is updated for each arriving tile.</w:t>
       </w:r>
     </w:p>
   </w:comment>
@@ -40535,7 +40639,7 @@
         <w:ind w:firstLineChars="0" w:firstLine="0"/>
       </w:pPr>
       <w:r>
-        <w:t>We apologize for not defining the reported correctness errors.</w:t>
+        <w:t>The error names appeared before their definitions, which made the correctness results hard to interpret.</w:t>
       </w:r>
     </w:p>
     <w:p>
@@ -40544,7 +40648,7 @@
         <w:ind w:firstLineChars="0" w:firstLine="0"/>
       </w:pPr>
       <w:r>
-        <w:t>Response: The report now defines maximum absolute error as max_i |y_i−y_ref,i| and relative L2 error as ||y−y_ref||_2/||y_ref||_2, and states that full and causal runs are checked separately.</w:t>
+        <w:t>The correctness section now defines maximum absolute error as max_i |y_i−y_ref,i| and relative L2 error as ||y−y_ref||₂/||y_ref||₂. It also says that full and causal cases are validated separately.</w:t>
       </w:r>
     </w:p>
   </w:comment>
@@ -40574,7 +40678,7 @@
         <w:ind w:firstLineChars="0" w:firstLine="0"/>
       </w:pPr>
       <w:r>
-        <w:t>We apologize that the earlier appendix emphasized execution commands instead of pointing clearly to the implementation source.</w:t>
+        <w:t>The appendix made the run commands easier to find than the implementation itself.</w:t>
       </w:r>
     </w:p>
     <w:p>
@@ -40583,7 +40687,7 @@
         <w:ind w:firstLineChars="0" w:firstLine="0"/>
       </w:pPr>
       <w:r>
-        <w:t>Response: Appendix 2 now links to the actual CUDA/MPI source and Vanda serial, OpenMP, and MPI+OpenMP C++ source in the GitHub code directories.</w:t>
+        <w:t>Appendix 2 now points directly to the CUDA/MPI source and to the Vanda serial, OpenMP, and MPI+OpenMP C++ source in the repository’s code directories.</w:t>
       </w:r>
     </w:p>
   </w:comment>
@@ -40613,7 +40717,7 @@
         <w:ind w:firstLineChars="0" w:firstLine="0"/>
       </w:pPr>
       <w:r>
-        <w:t>We apologize that the original weak-scaling discussion did not quantify the MPI contribution.</w:t>
+        <w:t>The earlier weak-scaling paragraph did not quantify how much of the increase came from MPI.</w:t>
       </w:r>
     </w:p>
     <w:p>
@@ -40622,7 +40726,7 @@
         <w:ind w:firstLineChars="0" w:firstLine="0"/>
       </w:pPr>
       <w:r>
-        <w:t>Response: The added repeated measurements show MPI accounts for about 52%–67% of the total-time increase, depending on N. Communication is substantial, but the measured data do not show it is the sole cause.</w:t>
+        <w:t>The repeated measurements now include MPI-phase timings. MPI accounts for approximately 52%–67% of the increase in total time across the reported pairs, so communication is substantial but the measurements do not support attributing the whole increase to communication.</w:t>
       </w:r>
     </w:p>
   </w:comment>
@@ -40652,7 +40756,7 @@
         <w:ind w:firstLineChars="0" w:firstLine="0"/>
       </w:pPr>
       <w:r>
-        <w:t>We apologize that the original conclusion did not point clearly to the local GPU evidence.</w:t>
+        <w:t>The local GPU runs were mentioned in the conclusion without a clear pointer to their evidence.</w:t>
       </w:r>
     </w:p>
     <w:p>
@@ -40661,7 +40765,7 @@
         <w:ind w:firstLineChars="0" w:firstLine="0"/>
       </w:pPr>
       <w:r>
-        <w:t>Response: Section 3.3 and Table 3 report local RTX 4090 timings and validation, including N=257 full/causal, N=1024, and N=4096. Appendix 1 contains terminal evidence.</w:t>
+        <w:t>Section 3.3 and Table 3 now show the RTX 4090 timings and validation results, including N=257 full and causal runs and the N=1024 and N=4096 benchmarks. Appendix 1 contains the corresponding terminal captures.</w:t>
       </w:r>
     </w:p>
   </w:comment>
@@ -40691,7 +40795,7 @@
         <w:ind w:firstLineChars="0" w:firstLine="0"/>
       </w:pPr>
       <w:r>
-        <w:t>We apologize that the earlier report did not explain the tile-size result in terms of the blocked loops.</w:t>
+        <w:t>The tile-size results needed an explanation tied to the work the kernel performs.</w:t>
       </w:r>
     </w:p>
     <w:p>
@@ -40700,7 +40804,7 @@
         <w:ind w:firstLineChars="0" w:firstLine="0"/>
       </w:pPr>
       <w:r>
-        <w:t>Response: The report now gives the tile-pair count at N=4096 (2048 for 64×128 versus 512 for 128×256) and the measured median reduction from 15.308 ms to 5.124 ms. Reduced loop iterations are supported by the measurements; hardware-level causes are not claimed as separately profiled.</w:t>
+        <w:t>The discussion now compares 2048 query/key-value tile pairs for 64×128 against 512 pairs for 128×256 at N=4096, alongside the measured change from 15.308 ms to 5.124 ms. It describes fewer tile iterations as a plausible explanation and does not present it as a separately profiled cause.</w:t>
       </w:r>
     </w:p>
   </w:comment>

</xml_diff>